<commit_message>
Adiciona link do repositorio GitHub na metodologia
Co-Authored-By: Claude Opus 4.6 (1M context) <noreply@anthropic.com>
</commit_message>
<xml_diff>
--- a/metodologia-mapa-pg.docx
+++ b/metodologia-mapa-pg.docx
@@ -662,6 +662,54 @@
         <w:t>Todo o processamento descrito neste documento é realizado por meio de scripts Python executados sequencialmente. A ordem de execução é: (1) baixar_openalex.py, (2) extrair_fisica.py, (3) extrair_issn_fisica.py e (4) preparar_dados_pos_d.py. Um script integrador (executar_tudo.py) automatiza a execução de toda a pipeline, incluindo as etapas de análise subsequentes. Os dados de entrada são integralmente públicos e as URLs de download estão documentadas no sistema.</w:t>
       </w:r>
     </w:p>
+    <w:p>
+      <w:pPr>
+        <w:pStyle w:val="Heading1"/>
+      </w:pPr>
+      <w:r>
+        <w:rPr>
+          <w:rFonts w:ascii="Times New Roman" w:hAnsi="Times New Roman"/>
+        </w:rPr>
+        <w:t>9. Repositório e Disponibilidade</w:t>
+      </w:r>
+    </w:p>
+    <w:p>
+      <w:pPr>
+        <w:jc w:val="both"/>
+      </w:pPr>
+      <w:r>
+        <w:rPr>
+          <w:rFonts w:ascii="Times New Roman" w:hAnsi="Times New Roman"/>
+          <w:sz w:val="24"/>
+        </w:rPr>
+        <w:t>O código-fonte do aplicativo MAPA-PG, os dados pré-processados, a documentação completa com as URLs de download dos dados brutos da CAPES e este documento de metodologia encontram-se disponíveis publicamente no repositório GitHub do projeto:</w:t>
+      </w:r>
+    </w:p>
+    <w:p>
+      <w:pPr>
+        <w:jc w:val="center"/>
+      </w:pPr>
+      <w:r>
+        <w:rPr>
+          <w:rFonts w:ascii="Times New Roman" w:hAnsi="Times New Roman"/>
+          <w:b/>
+          <w:sz w:val="24"/>
+        </w:rPr>
+        <w:t>https://github.com/david888azv/Mapa-PG</w:t>
+      </w:r>
+    </w:p>
+    <w:p>
+      <w:pPr>
+        <w:jc w:val="both"/>
+      </w:pPr>
+      <w:r>
+        <w:rPr>
+          <w:rFonts w:ascii="Times New Roman" w:hAnsi="Times New Roman"/>
+          <w:sz w:val="24"/>
+        </w:rPr>
+        <w:t>O repositório contém todos os arquivos necessários para execução do sistema em qualquer computador com navegador moderno, sem necessidade de instalação de software adicional.</w:t>
+      </w:r>
+    </w:p>
     <w:sectPr>
       <w:pgSz w:w="12240" w:h="15840"/>
       <w:pgMar w:top="1417" w:right="1417" w:bottom="1417" w:left="1701" w:header="720" w:footer="720" w:gutter="0"/>

</xml_diff>